<commit_message>
fix(template): remove redundant text in SARL AU statuts template
</commit_message>
<xml_diff>
--- a/templates/SARL AU/SARL-AU_2026-07_Statuts_Template.docx
+++ b/templates/SARL AU/SARL-AU_2026-07_Statuts_Template.docx
@@ -145,7 +145,7 @@
               <w:t xml:space="preserve"> </w:t>
             </w:r>
             <w:r>
-              <w:t>dirhams marocains</w:t>
+              <w:t>dirhams</w:t>
             </w:r>
           </w:p>
         </w:tc>
@@ -286,7 +286,19 @@
           </w:tcPr>
           <w:p>
             <w:r>
-              <w:t>_ASSOCIE_CIVILITE__ASSOCIE_PRENOM__ASSOCIE_NOM_</w:t>
+              <w:t>_ASSOCIE_CIVILITE_</w:t>
+            </w:r>
+            <w:r>
+              <w:t xml:space="preserve"> </w:t>
+            </w:r>
+            <w:r>
+              <w:t>_ASSOCIE_PRENOM_</w:t>
+            </w:r>
+            <w:r>
+              <w:t xml:space="preserve"> </w:t>
+            </w:r>
+            <w:r>
+              <w:t>_ASSOCIE_NOM_</w:t>
             </w:r>
           </w:p>
         </w:tc>
@@ -638,38 +650,46 @@
         <w:t xml:space="preserve">Le capital social est fixé à la somme de </w:t>
       </w:r>
       <w:r>
+        <w:rPr>
+          <w:b/>
+          <w:bCs/>
+        </w:rPr>
+        <w:t>_SOCIETE_CAPITAL</w:t>
+      </w:r>
+      <w:r>
         <w:t>_</w:t>
       </w:r>
-      <w:proofErr w:type="spellStart"/>
-      <w:r>
-        <w:t>SOCIETE_CAPITAL_</w:t>
-      </w:r>
-      <w:r>
-        <w:t>dirhams</w:t>
-      </w:r>
-      <w:proofErr w:type="spellEnd"/>
-      <w:r>
-        <w:t xml:space="preserve"> marocains (MAD). Il est divisé en </w:t>
-      </w:r>
-      <w:r>
-        <w:t>_SOCIETE_PART_SOCIAL_</w:t>
+      <w:r>
+        <w:t xml:space="preserve"> (MAD). Il est divisé en </w:t>
+      </w:r>
+      <w:r>
+        <w:rPr>
+          <w:b/>
+          <w:bCs/>
+        </w:rPr>
+        <w:t xml:space="preserve">_SOCIETE_PART_SOCIAL_ </w:t>
+      </w:r>
+      <w:r>
+        <w:t xml:space="preserve">parts sociales d'une valeur nominale de </w:t>
+      </w:r>
+      <w:r>
+        <w:rPr>
+          <w:b/>
+          <w:bCs/>
+        </w:rPr>
+        <w:t>_SOCIETE_VALEUR_NOMINALE_</w:t>
       </w:r>
       <w:r>
         <w:t xml:space="preserve"> </w:t>
       </w:r>
       <w:r>
-        <w:t xml:space="preserve">parts sociales d'une valeur nominale de </w:t>
-      </w:r>
-      <w:r>
-        <w:t>_SOCIETE_VALEUR_NOMINALE_</w:t>
-      </w:r>
-      <w:r>
-        <w:t xml:space="preserve"> </w:t>
-      </w:r>
-      <w:r>
         <w:t xml:space="preserve">dirhams chacune, numérotées de 1 à </w:t>
       </w:r>
       <w:r>
+        <w:rPr>
+          <w:b/>
+          <w:bCs/>
+        </w:rPr>
         <w:t>_SOCIETE_PART_SOCIAL_</w:t>
       </w:r>
       <w:r>
@@ -728,6 +748,10 @@
         <w:t xml:space="preserve">L'associé unique apporte à la société une somme en numéraire de </w:t>
       </w:r>
       <w:r>
+        <w:rPr>
+          <w:b/>
+          <w:bCs/>
+        </w:rPr>
         <w:t>_SOCIETE_CAPITAL_</w:t>
       </w:r>
       <w:r>
@@ -831,34 +855,79 @@
         <w:t xml:space="preserve"> </w:t>
       </w:r>
       <w:r>
+        <w:rPr>
+          <w:b/>
+          <w:bCs/>
+        </w:rPr>
         <w:t>_ASSOCIE_NOM_COMPLET_</w:t>
       </w:r>
       <w:r>
-        <w:t xml:space="preserve">, né(e) le </w:t>
-      </w:r>
-      <w:r>
+        <w:rPr>
+          <w:b/>
+          <w:bCs/>
+        </w:rPr>
+        <w:t>,</w:t>
+      </w:r>
+      <w:r>
+        <w:t xml:space="preserve"> né(e) le </w:t>
+      </w:r>
+      <w:r>
+        <w:rPr>
+          <w:b/>
+          <w:bCs/>
+        </w:rPr>
         <w:t>_ASSOCIE_DATE_NAISSANCE_</w:t>
       </w:r>
       <w:r>
-        <w:t xml:space="preserve">, de nationalité </w:t>
-      </w:r>
-      <w:r>
+        <w:rPr>
+          <w:b/>
+          <w:bCs/>
+        </w:rPr>
+        <w:t xml:space="preserve">, </w:t>
+      </w:r>
+      <w:r>
+        <w:t xml:space="preserve">de nationalité </w:t>
+      </w:r>
+      <w:r>
+        <w:rPr>
+          <w:b/>
+          <w:bCs/>
+        </w:rPr>
         <w:t>_ASSOCIE_NATIONALITE_</w:t>
       </w:r>
       <w:r>
-        <w:t xml:space="preserve">, titulaire de </w:t>
-      </w:r>
-      <w:r>
+        <w:rPr>
+          <w:b/>
+          <w:bCs/>
+        </w:rPr>
+        <w:t>,</w:t>
+      </w:r>
+      <w:r>
+        <w:t xml:space="preserve"> titulaire de </w:t>
+      </w:r>
+      <w:r>
+        <w:rPr>
+          <w:b/>
+          <w:bCs/>
+        </w:rPr>
         <w:t>_ASSOCIE_CIN_</w:t>
       </w:r>
       <w:r>
-        <w:t xml:space="preserve">, demeurant à </w:t>
-      </w:r>
-      <w:r>
-        <w:t>_ASSOCIE_ADRESSE_</w:t>
-      </w:r>
-      <w:r>
-        <w:t>.</w:t>
+        <w:rPr>
+          <w:b/>
+          <w:bCs/>
+        </w:rPr>
+        <w:t xml:space="preserve">, </w:t>
+      </w:r>
+      <w:r>
+        <w:t xml:space="preserve">demeurant à </w:t>
+      </w:r>
+      <w:r>
+        <w:rPr>
+          <w:b/>
+          <w:bCs/>
+        </w:rPr>
+        <w:t>_ASSOCIE_ADRESSE_.</w:t>
       </w:r>
     </w:p>
     <w:p>
@@ -876,7 +945,6 @@
         <w:jc w:val="both"/>
       </w:pPr>
       <w:r>
-        <w:lastRenderedPageBreak/>
         <w:t>En cas de décès, démission, révocation, incapacité ou empêchement du gérant, l'associé unique procédera à son remplacement dans les meilleurs délais. Les actes accomplis par le gérant jusqu'à la publication de la cessation de ses fonctions demeurent opposables dans les conditions de droit commun.</w:t>
       </w:r>
     </w:p>
@@ -890,6 +958,7 @@
           <w:color w:val="1F4E79"/>
           <w:sz w:val="22"/>
         </w:rPr>
+        <w:lastRenderedPageBreak/>
         <w:t>ARTICLE 11 - POUVOIRS DU GÉRANT</w:t>
       </w:r>
     </w:p>
@@ -1103,7 +1172,6 @@
         <w:jc w:val="both"/>
       </w:pPr>
       <w:r>
-        <w:lastRenderedPageBreak/>
         <w:t>Après paiement des dettes sociales et remboursement du capital, le solde disponible constitue le boni de liquidation attribué à l'associé unique, sauf disposition légale contraire. Les formalités de clôture de liquidation, radiation, publicité et dépôt seront accomplies conformément aux textes en vigueur.</w:t>
       </w:r>
     </w:p>
@@ -1123,6 +1191,7 @@
         <w:jc w:val="both"/>
       </w:pPr>
       <w:r>
+        <w:lastRenderedPageBreak/>
         <w:t>Toutes contestations relatives à l'interprétation, l'exécution ou la validité des présents statuts, ainsi qu'au fonctionnement de la société, seront soumises aux juridictions marocaines compétentes du ressort du siège social, sauf compétence impérative différente prévue par la loi.</w:t>
       </w:r>
     </w:p>
@@ -1260,7 +1329,17 @@
         <w:jc w:val="both"/>
       </w:pPr>
       <w:r>
-        <w:t>La signature bancaire est exercée par _GERANT_NOM_COMPLET_, qui dispose de tous pouvoirs pour ouvrir, faire fonctionner et clôturer les comptes bancaires de la société et signer tout document y afférent. L’associé unique peut modifier ces pouvoirs ou accorder toute procuration par décision écrite.</w:t>
+        <w:t xml:space="preserve">La signature bancaire est exercée par </w:t>
+      </w:r>
+      <w:r>
+        <w:rPr>
+          <w:b/>
+          <w:bCs/>
+        </w:rPr>
+        <w:t>_GERANT_NOM_COMPLET_,</w:t>
+      </w:r>
+      <w:r>
+        <w:t xml:space="preserve"> qui dispose de tous pouvoirs pour ouvrir, faire fonctionner et clôturer les comptes bancaires de la société et signer tout document y afférent. L’associé unique peut modifier ces pouvoirs ou accorder toute procuration par décision écrite.</w:t>
       </w:r>
     </w:p>
     <w:p>
@@ -1316,7 +1395,27 @@
           <w:sz w:val="18"/>
           <w:szCs w:val="18"/>
         </w:rPr>
-        <w:t>Les frais de constitution et d’immatriculation sont supportés par la société. Tous pouvoirs sont donnés à _GERANT_NOM_COMPLET_ et au porteur d’un exemplaire des présents statuts pour accomplir les formalités requises.</w:t>
+        <w:t xml:space="preserve">Les frais de constitution et d’immatriculation sont supportés par la société. Tous pouvoirs sont donnés à </w:t>
+      </w:r>
+      <w:r>
+        <w:rPr>
+          <w:rStyle w:val="normaltextrun"/>
+          <w:rFonts w:ascii="Arial" w:hAnsi="Arial" w:cs="Arial"/>
+          <w:b/>
+          <w:bCs/>
+          <w:sz w:val="18"/>
+          <w:szCs w:val="18"/>
+        </w:rPr>
+        <w:t>_GERANT_NOM_COMPLET_</w:t>
+      </w:r>
+      <w:r>
+        <w:rPr>
+          <w:rStyle w:val="normaltextrun"/>
+          <w:rFonts w:ascii="Arial" w:hAnsi="Arial" w:cs="Arial"/>
+          <w:sz w:val="18"/>
+          <w:szCs w:val="18"/>
+        </w:rPr>
+        <w:t xml:space="preserve"> et au porteur d’un exemplaire des présents statuts pour accomplir les formalités requises.</w:t>
       </w:r>
     </w:p>
     <w:p>
@@ -1338,7 +1437,27 @@
           <w:sz w:val="18"/>
           <w:szCs w:val="18"/>
         </w:rPr>
-        <w:t>Tout litige relève du _SOCIETE_TRIBUNAL_TYPE_ de _SOCIETE_TRIBUNAL_, sous réserve des règles impératives de compétence.</w:t>
+        <w:t xml:space="preserve">Tout litige relève du </w:t>
+      </w:r>
+      <w:r>
+        <w:rPr>
+          <w:rStyle w:val="normaltextrun"/>
+          <w:rFonts w:ascii="Arial" w:hAnsi="Arial" w:cs="Arial"/>
+          <w:b/>
+          <w:bCs/>
+          <w:sz w:val="18"/>
+          <w:szCs w:val="18"/>
+        </w:rPr>
+        <w:t xml:space="preserve">_SOCIETE_TRIBUNAL_TYPE_ de _SOCIETE_TRIBUNAL_, </w:t>
+      </w:r>
+      <w:r>
+        <w:rPr>
+          <w:rStyle w:val="normaltextrun"/>
+          <w:rFonts w:ascii="Arial" w:hAnsi="Arial" w:cs="Arial"/>
+          <w:sz w:val="18"/>
+          <w:szCs w:val="18"/>
+        </w:rPr>
+        <w:t>sous réserve des règles impératives de compétence.</w:t>
       </w:r>
     </w:p>
     <w:p>
@@ -1442,13 +1561,14 @@
             </w:r>
             <w:r>
               <w:br/>
-              <w:t>Nom : [</w:t>
+              <w:t xml:space="preserve">Nom : </w:t>
             </w:r>
             <w:r>
+              <w:rPr>
+                <w:b/>
+                <w:bCs/>
+              </w:rPr>
               <w:t>_ASSOCIE_NOM_COMPLET_</w:t>
-            </w:r>
-            <w:r>
-              <w:t>]</w:t>
             </w:r>
             <w:r>
               <w:br/>
@@ -1543,7 +1663,10 @@
       <w:fldChar w:fldCharType="end"/>
     </w:r>
     <w:r>
-      <w:t xml:space="preserve"> / 6</w:t>
+      <w:t xml:space="preserve"> / </w:t>
+    </w:r>
+    <w:r>
+      <w:t>4</w:t>
     </w:r>
   </w:p>
 </w:ftr>
@@ -1592,7 +1715,7 @@
         <w:color w:val="606060"/>
         <w:sz w:val="16"/>
       </w:rPr>
-      <w:t xml:space="preserve">STATUTS </w:t>
+      <w:t>STATUTS</w:t>
     </w:r>
     <w:r>
       <w:rPr>
@@ -1601,7 +1724,25 @@
         <w:color w:val="606060"/>
         <w:sz w:val="16"/>
       </w:rPr>
-      <w:t>[DENOMINATION SOCIALE] SARL AU</w:t>
+      <w:t xml:space="preserve"> </w:t>
+    </w:r>
+    <w:r>
+      <w:rPr>
+        <w:b/>
+        <w:bCs/>
+        <w:color w:val="606060"/>
+        <w:sz w:val="16"/>
+      </w:rPr>
+      <w:t xml:space="preserve">_SOCIETE_RAISON_SOCIALE_ </w:t>
+    </w:r>
+    <w:r>
+      <w:rPr>
+        <w:b/>
+        <w:bCs/>
+        <w:color w:val="606060"/>
+        <w:sz w:val="16"/>
+      </w:rPr>
+      <w:t>SARL AU</w:t>
     </w:r>
     <w:r>
       <w:rPr>

</xml_diff>